<commit_message>
Add collapsible sidebars, floating restore controls, banner minimize, and keyboard shortcuts
</commit_message>
<xml_diff>
--- a/DAG visualizer/Light Weight Visualizer.docx
+++ b/DAG visualizer/Light Weight Visualizer.docx
@@ -2,7 +2,7 @@
 <file path=word/document.xml><?xml version="1.0" encoding="utf-8"?>
 <w:document xmlns:w="http://schemas.openxmlformats.org/wordprocessingml/2006/main" xmlns:m="http://schemas.openxmlformats.org/officeDocument/2006/math" xmlns:r="http://schemas.openxmlformats.org/officeDocument/2006/relationships" xmlns:o="urn:schemas-microsoft-com:office:office" xmlns:v="urn:schemas-microsoft-com:vml" xmlns:w10="urn:schemas-microsoft-com:office:word" xmlns:a="http://schemas.openxmlformats.org/drawingml/2006/main" xmlns:pic="http://schemas.openxmlformats.org/drawingml/2006/picture" xmlns:wp="http://schemas.openxmlformats.org/drawingml/2006/wordprocessingDrawing">
   <w:body>
-    <w:bookmarkStart w:id="33" w:name="tbi-dnn-interactive-dag-visualizer"/>
+    <w:bookmarkStart w:id="34" w:name="tbi-dnn-interactive-dag-visualizer"/>
     <w:p>
       <w:pPr>
         <w:pStyle w:val="Heading1"/>
@@ -332,7 +332,7 @@
     </w:p>
     <w:bookmarkEnd w:id="22"/>
     <w:bookmarkEnd w:id="23"/>
-    <w:bookmarkStart w:id="29" w:name="key-features-how-to-use"/>
+    <w:bookmarkStart w:id="30" w:name="key-features-how-to-use"/>
     <w:p>
       <w:pPr>
         <w:pStyle w:val="Heading2"/>
@@ -557,13 +557,447 @@
       </w:r>
     </w:p>
     <w:bookmarkEnd w:id="25"/>
-    <w:bookmarkStart w:id="26" w:name="interactive-dag-canvas"/>
+    <w:bookmarkStart w:id="26" w:name="collapsible-sidebars-canvas-workspace"/>
     <w:p>
       <w:pPr>
         <w:pStyle w:val="Heading3"/>
       </w:pPr>
       <w:r>
-        <w:t xml:space="preserve">3. Interactive DAG Canvas</w:t>
+        <w:t xml:space="preserve">3. Collapsible Sidebars &amp; Canvas Workspace</w:t>
+      </w:r>
+    </w:p>
+    <w:p>
+      <w:pPr>
+        <w:pStyle w:val="FirstParagraph"/>
+      </w:pPr>
+      <w:r>
+        <w:t xml:space="preserve">To provide a clean, unobstructed view of complex DAG networks:</w:t>
+      </w:r>
+      <w:r>
+        <w:t xml:space="preserve"> </w:t>
+      </w:r>
+      <w:r>
+        <w:t xml:space="preserve">-</w:t>
+      </w:r>
+      <w:r>
+        <w:t xml:space="preserve"> </w:t>
+      </w:r>
+      <w:r>
+        <w:rPr>
+          <w:bCs/>
+          <w:b/>
+        </w:rPr>
+        <w:t xml:space="preserve">Collapsible Clusters Explorer (Left)</w:t>
+      </w:r>
+      <w:r>
+        <w:t xml:space="preserve">: Click the</w:t>
+      </w:r>
+      <w:r>
+        <w:t xml:space="preserve"> </w:t>
+      </w:r>
+      <w:r>
+        <w:rPr>
+          <w:rStyle w:val="VerbatimChar"/>
+          <w:bCs/>
+          <w:b/>
+        </w:rPr>
+        <w:t xml:space="preserve">&lt;</w:t>
+      </w:r>
+      <w:r>
+        <w:t xml:space="preserve"> </w:t>
+      </w:r>
+      <w:r>
+        <w:t xml:space="preserve">icon in the sidebar header, the</w:t>
+      </w:r>
+      <w:r>
+        <w:t xml:space="preserve"> </w:t>
+      </w:r>
+      <w:r>
+        <w:rPr>
+          <w:rStyle w:val="VerbatimChar"/>
+          <w:bCs/>
+          <w:b/>
+        </w:rPr>
+        <w:t xml:space="preserve">Clusters</w:t>
+      </w:r>
+      <w:r>
+        <w:t xml:space="preserve"> </w:t>
+      </w:r>
+      <w:r>
+        <w:t xml:space="preserve">button in the top navigation, or press</w:t>
+      </w:r>
+      <w:r>
+        <w:t xml:space="preserve"> </w:t>
+      </w:r>
+      <w:r>
+        <w:rPr>
+          <w:rStyle w:val="VerbatimChar"/>
+          <w:bCs/>
+          <w:b/>
+        </w:rPr>
+        <w:t xml:space="preserve">[</w:t>
+      </w:r>
+      <w:r>
+        <w:t xml:space="preserve"> </w:t>
+      </w:r>
+      <w:r>
+        <w:t xml:space="preserve">on your keyboard. When collapsed, a floating</w:t>
+      </w:r>
+      <w:r>
+        <w:t xml:space="preserve"> </w:t>
+      </w:r>
+      <w:r>
+        <w:rPr>
+          <w:rStyle w:val="VerbatimChar"/>
+          <w:bCs/>
+          <w:b/>
+        </w:rPr>
+        <w:t xml:space="preserve">Clusters</w:t>
+      </w:r>
+      <w:r>
+        <w:t xml:space="preserve"> </w:t>
+      </w:r>
+      <w:r>
+        <w:t xml:space="preserve">tab on the left lets you re-open it instantly.</w:t>
+      </w:r>
+      <w:r>
+        <w:t xml:space="preserve"> </w:t>
+      </w:r>
+      <w:r>
+        <w:t xml:space="preserve">-</w:t>
+      </w:r>
+      <w:r>
+        <w:t xml:space="preserve"> </w:t>
+      </w:r>
+      <w:r>
+        <w:rPr>
+          <w:bCs/>
+          <w:b/>
+        </w:rPr>
+        <w:t xml:space="preserve">Collapsible Element Inspector (Right)</w:t>
+      </w:r>
+      <w:r>
+        <w:t xml:space="preserve">: Click the</w:t>
+      </w:r>
+      <w:r>
+        <w:t xml:space="preserve"> </w:t>
+      </w:r>
+      <w:r>
+        <w:rPr>
+          <w:rStyle w:val="VerbatimChar"/>
+          <w:bCs/>
+          <w:b/>
+        </w:rPr>
+        <w:t xml:space="preserve">&gt;</w:t>
+      </w:r>
+      <w:r>
+        <w:t xml:space="preserve"> </w:t>
+      </w:r>
+      <w:r>
+        <w:t xml:space="preserve">icon in the inspector header, the</w:t>
+      </w:r>
+      <w:r>
+        <w:t xml:space="preserve"> </w:t>
+      </w:r>
+      <w:r>
+        <w:rPr>
+          <w:rStyle w:val="VerbatimChar"/>
+          <w:bCs/>
+          <w:b/>
+        </w:rPr>
+        <w:t xml:space="preserve">Inspector</w:t>
+      </w:r>
+      <w:r>
+        <w:t xml:space="preserve"> </w:t>
+      </w:r>
+      <w:r>
+        <w:t xml:space="preserve">button in the top navigation, or press</w:t>
+      </w:r>
+      <w:r>
+        <w:t xml:space="preserve"> </w:t>
+      </w:r>
+      <w:r>
+        <w:rPr>
+          <w:rStyle w:val="VerbatimChar"/>
+          <w:bCs/>
+          <w:b/>
+        </w:rPr>
+        <w:t xml:space="preserve">]</w:t>
+      </w:r>
+      <w:r>
+        <w:t xml:space="preserve"> </w:t>
+      </w:r>
+      <w:r>
+        <w:t xml:space="preserve">on your keyboard. When collapsed, a floating</w:t>
+      </w:r>
+      <w:r>
+        <w:t xml:space="preserve"> </w:t>
+      </w:r>
+      <w:r>
+        <w:rPr>
+          <w:rStyle w:val="VerbatimChar"/>
+          <w:bCs/>
+          <w:b/>
+        </w:rPr>
+        <w:t xml:space="preserve">Inspector</w:t>
+      </w:r>
+      <w:r>
+        <w:t xml:space="preserve"> </w:t>
+      </w:r>
+      <w:r>
+        <w:t xml:space="preserve">tab on the right allows quick restoration.</w:t>
+      </w:r>
+      <w:r>
+        <w:t xml:space="preserve"> </w:t>
+      </w:r>
+      <w:r>
+        <w:t xml:space="preserve">-</w:t>
+      </w:r>
+      <w:r>
+        <w:t xml:space="preserve"> </w:t>
+      </w:r>
+      <w:r>
+        <w:rPr>
+          <w:bCs/>
+          <w:b/>
+        </w:rPr>
+        <w:t xml:space="preserve">Auto-Expand on Selection</w:t>
+      </w:r>
+      <w:r>
+        <w:t xml:space="preserve">: Clicking any node or causal edge automatically expands the inspector if it was collapsed.</w:t>
+      </w:r>
+      <w:r>
+        <w:t xml:space="preserve"> </w:t>
+      </w:r>
+      <w:r>
+        <w:t xml:space="preserve">-</w:t>
+      </w:r>
+      <w:r>
+        <w:t xml:space="preserve"> </w:t>
+      </w:r>
+      <w:r>
+        <w:rPr>
+          <w:bCs/>
+          <w:b/>
+        </w:rPr>
+        <w:t xml:space="preserve">Minimizable Cluster Banner</w:t>
+      </w:r>
+      <w:r>
+        <w:t xml:space="preserve">: Click the</w:t>
+      </w:r>
+      <w:r>
+        <w:t xml:space="preserve"> </w:t>
+      </w:r>
+      <w:r>
+        <w:rPr>
+          <w:rStyle w:val="VerbatimChar"/>
+          <w:bCs/>
+          <w:b/>
+        </w:rPr>
+        <w:t xml:space="preserve">−</w:t>
+      </w:r>
+      <w:r>
+        <w:t xml:space="preserve"> </w:t>
+      </w:r>
+      <w:r>
+        <w:t xml:space="preserve">button on the floating cluster summary banner to minimize it into a compact pill.</w:t>
+      </w:r>
+      <w:r>
+        <w:t xml:space="preserve"> </w:t>
+      </w:r>
+      <w:r>
+        <w:t xml:space="preserve">-</w:t>
+      </w:r>
+      <w:r>
+        <w:t xml:space="preserve"> </w:t>
+      </w:r>
+      <w:r>
+        <w:rPr>
+          <w:bCs/>
+          <w:b/>
+        </w:rPr>
+        <w:t xml:space="preserve">Zen View (Maximize Canvas)</w:t>
+      </w:r>
+      <w:r>
+        <w:t xml:space="preserve">: Click</w:t>
+      </w:r>
+      <w:r>
+        <w:t xml:space="preserve"> </w:t>
+      </w:r>
+      <w:r>
+        <w:rPr>
+          <w:rStyle w:val="VerbatimChar"/>
+          <w:bCs/>
+          <w:b/>
+        </w:rPr>
+        <w:t xml:space="preserve">Zen View</w:t>
+      </w:r>
+      <w:r>
+        <w:t xml:space="preserve"> </w:t>
+      </w:r>
+      <w:r>
+        <w:t xml:space="preserve">in the header or press</w:t>
+      </w:r>
+      <w:r>
+        <w:t xml:space="preserve"> </w:t>
+      </w:r>
+      <w:r>
+        <w:rPr>
+          <w:rStyle w:val="VerbatimChar"/>
+          <w:bCs/>
+          <w:b/>
+        </w:rPr>
+        <w:t xml:space="preserve">z</w:t>
+      </w:r>
+      <w:r>
+        <w:t xml:space="preserve"> </w:t>
+      </w:r>
+      <w:r>
+        <w:t xml:space="preserve">on your keyboard to instantly collapse both sidebars for full-screen graph analysis and presentation.</w:t>
+      </w:r>
+      <w:r>
+        <w:t xml:space="preserve"> </w:t>
+      </w:r>
+      <w:r>
+        <w:t xml:space="preserve">-</w:t>
+      </w:r>
+      <w:r>
+        <w:t xml:space="preserve"> </w:t>
+      </w:r>
+      <w:r>
+        <w:rPr>
+          <w:bCs/>
+          <w:b/>
+        </w:rPr>
+        <w:t xml:space="preserve">Keyboard Shortcuts</w:t>
+      </w:r>
+      <w:r>
+        <w:t xml:space="preserve">:</w:t>
+      </w:r>
+      <w:r>
+        <w:t xml:space="preserve"> </w:t>
+      </w:r>
+      <w:r>
+        <w:t xml:space="preserve">-</w:t>
+      </w:r>
+      <w:r>
+        <w:t xml:space="preserve"> </w:t>
+      </w:r>
+      <w:r>
+        <w:rPr>
+          <w:rStyle w:val="VerbatimChar"/>
+          <w:bCs/>
+          <w:b/>
+        </w:rPr>
+        <w:t xml:space="preserve">[</w:t>
+      </w:r>
+      <w:r>
+        <w:t xml:space="preserve"> </w:t>
+      </w:r>
+      <w:r>
+        <w:t xml:space="preserve">: Toggle Left Clusters Explorer</w:t>
+      </w:r>
+      <w:r>
+        <w:t xml:space="preserve"> </w:t>
+      </w:r>
+      <w:r>
+        <w:t xml:space="preserve">-</w:t>
+      </w:r>
+      <w:r>
+        <w:t xml:space="preserve"> </w:t>
+      </w:r>
+      <w:r>
+        <w:rPr>
+          <w:rStyle w:val="VerbatimChar"/>
+          <w:bCs/>
+          <w:b/>
+        </w:rPr>
+        <w:t xml:space="preserve">]</w:t>
+      </w:r>
+      <w:r>
+        <w:t xml:space="preserve"> </w:t>
+      </w:r>
+      <w:r>
+        <w:t xml:space="preserve">: Toggle Right Element Inspector</w:t>
+      </w:r>
+      <w:r>
+        <w:t xml:space="preserve"> </w:t>
+      </w:r>
+      <w:r>
+        <w:t xml:space="preserve">-</w:t>
+      </w:r>
+      <w:r>
+        <w:t xml:space="preserve"> </w:t>
+      </w:r>
+      <w:r>
+        <w:rPr>
+          <w:rStyle w:val="VerbatimChar"/>
+          <w:bCs/>
+          <w:b/>
+        </w:rPr>
+        <w:t xml:space="preserve">z</w:t>
+      </w:r>
+      <w:r>
+        <w:t xml:space="preserve"> </w:t>
+      </w:r>
+      <w:r>
+        <w:t xml:space="preserve">: Toggle Zen View (Full Canvas)</w:t>
+      </w:r>
+      <w:r>
+        <w:t xml:space="preserve"> </w:t>
+      </w:r>
+      <w:r>
+        <w:t xml:space="preserve">-</w:t>
+      </w:r>
+      <w:r>
+        <w:t xml:space="preserve"> </w:t>
+      </w:r>
+      <w:r>
+        <w:rPr>
+          <w:rStyle w:val="VerbatimChar"/>
+          <w:bCs/>
+          <w:b/>
+        </w:rPr>
+        <w:t xml:space="preserve">f</w:t>
+      </w:r>
+      <w:r>
+        <w:t xml:space="preserve"> </w:t>
+      </w:r>
+      <w:r>
+        <w:t xml:space="preserve">: Fit Graph to Screen</w:t>
+      </w:r>
+      <w:r>
+        <w:t xml:space="preserve"> </w:t>
+      </w:r>
+      <w:r>
+        <w:t xml:space="preserve">-</w:t>
+      </w:r>
+      <w:r>
+        <w:t xml:space="preserve"> </w:t>
+      </w:r>
+      <w:r>
+        <w:rPr>
+          <w:rStyle w:val="VerbatimChar"/>
+          <w:bCs/>
+          <w:b/>
+        </w:rPr>
+        <w:t xml:space="preserve">Esc</w:t>
+      </w:r>
+      <w:r>
+        <w:t xml:space="preserve"> </w:t>
+      </w:r>
+      <w:r>
+        <w:t xml:space="preserve">: Clear selection and reset view</w:t>
+      </w:r>
+    </w:p>
+    <w:bookmarkEnd w:id="26"/>
+    <w:bookmarkStart w:id="27" w:name="interactive-dag-canvas"/>
+    <w:p>
+      <w:pPr>
+        <w:pStyle w:val="Heading3"/>
+      </w:pPr>
+      <w:r>
+        <w:t xml:space="preserve">4. Interactive DAG Canvas</w:t>
       </w:r>
     </w:p>
     <w:p>
@@ -741,14 +1175,14 @@
         <w:t xml:space="preserve">button on the toolbar to toggle the color legend.</w:t>
       </w:r>
     </w:p>
-    <w:bookmarkEnd w:id="26"/>
-    <w:bookmarkStart w:id="27" w:name="element-inspection-evidence-traceability"/>
+    <w:bookmarkEnd w:id="27"/>
+    <w:bookmarkStart w:id="28" w:name="element-inspection-evidence-traceability"/>
     <w:p>
       <w:pPr>
         <w:pStyle w:val="Heading3"/>
       </w:pPr>
       <w:r>
-        <w:t xml:space="preserve">4. Element Inspection &amp; Evidence Traceability</w:t>
+        <w:t xml:space="preserve">5. Element Inspection &amp; Evidence Traceability</w:t>
       </w:r>
     </w:p>
     <w:p>
@@ -999,8 +1433,8 @@
         <w:t xml:space="preserve">links.</w:t>
       </w:r>
     </w:p>
-    <w:bookmarkEnd w:id="27"/>
-    <w:bookmarkStart w:id="28" w:name="exporting-figures-data"/>
+    <w:bookmarkEnd w:id="28"/>
+    <w:bookmarkStart w:id="29" w:name="exporting-figures-data"/>
     <w:p>
       <w:pPr>
         <w:pStyle w:val="Heading3"/>
@@ -1089,9 +1523,9 @@
         </w:pict>
       </w:r>
     </w:p>
-    <w:bookmarkEnd w:id="28"/>
     <w:bookmarkEnd w:id="29"/>
-    <w:bookmarkStart w:id="31" w:name="technical-architecture-file-structure"/>
+    <w:bookmarkEnd w:id="30"/>
+    <w:bookmarkStart w:id="32" w:name="technical-architecture-file-structure"/>
     <w:p>
       <w:pPr>
         <w:pStyle w:val="Heading2"/>
@@ -1156,7 +1590,7 @@
         <w:t xml:space="preserve">└── Light Weight Visualizer.docx # Word-format documentation for journal supplementary submission</w:t>
       </w:r>
     </w:p>
-    <w:bookmarkStart w:id="30" w:name="json-dag-schema-specification"/>
+    <w:bookmarkStart w:id="31" w:name="json-dag-schema-specification"/>
     <w:p>
       <w:pPr>
         <w:pStyle w:val="Heading3"/>
@@ -2112,9 +2546,9 @@
         </w:pict>
       </w:r>
     </w:p>
-    <w:bookmarkEnd w:id="30"/>
     <w:bookmarkEnd w:id="31"/>
-    <w:bookmarkStart w:id="32" w:name="browser-compatibility"/>
+    <w:bookmarkEnd w:id="32"/>
+    <w:bookmarkStart w:id="33" w:name="browser-compatibility"/>
     <w:p>
       <w:pPr>
         <w:pStyle w:val="Heading2"/>
@@ -2163,8 +2597,8 @@
         <w:t xml:space="preserve">No plugins, extensions, or internet connection required for core offline usage.</w:t>
       </w:r>
     </w:p>
-    <w:bookmarkEnd w:id="32"/>
     <w:bookmarkEnd w:id="33"/>
+    <w:bookmarkEnd w:id="34"/>
     <w:sectPr/>
   </w:body>
 </w:document>

</xml_diff>